<commit_message>
CV: personal projects + GitHub contact + WebFetch language guardrails
Adds three independent CV-pipeline improvements:

- Personal projects: fact base + tailored CV schemas, extract/tailor
  prompts, FR/EN labels, and a conditional Projects section in the
  DOCX template (omitted entirely when the fact base has none).
- GitHub contact: optional contact.github field carried from fact
  base into the contact line, inserted between LinkedIn and location.
- Language detection: WebFetch silently translates non-English
  postings; SKILL.md now warns and analyze_job_offer.md cross-checks
  market signals (IA, RTT, Swile, CDI, French cities, etc.) before
  setting detected_language.

Also ignores resources/old_cv_addendum.md.

Co-Authored-By: Claude Opus 4.7 (1M context) <noreply@anthropic.com>
</commit_message>
<xml_diff>
--- a/.claude/skills/job-application-tailor/templates/cv_template_en.docx
+++ b/.claude/skills/job-application-tailor/templates/cv_template_en.docx
@@ -198,6 +198,86 @@
       <w:pPr/>
       <w:r>
         <w:t>{%p endfor %}</w:t>
+      </w:r>
+    </w:p>
+    <w:p>
+      <w:pPr/>
+      <w:r>
+        <w:t>{%p if projects %}</w:t>
+      </w:r>
+    </w:p>
+    <w:p>
+      <w:pPr>
+        <w:pStyle w:val="SectionStyle"/>
+      </w:pPr>
+      <w:r>
+        <w:t>Personal Projects</w:t>
+      </w:r>
+    </w:p>
+    <w:p>
+      <w:pPr/>
+      <w:r>
+        <w:t>{%p for project in projects %}</w:t>
+      </w:r>
+    </w:p>
+    <w:p>
+      <w:pPr>
+        <w:pStyle w:val="RoleStyle"/>
+      </w:pPr>
+      <w:r>
+        <w:t>{{project.name}}</w:t>
+      </w:r>
+    </w:p>
+    <w:p>
+      <w:pPr/>
+      <w:r>
+        <w:t>{%p if project.metadata_line %}</w:t>
+      </w:r>
+    </w:p>
+    <w:p>
+      <w:pPr>
+        <w:pStyle w:val="MetaStyle"/>
+      </w:pPr>
+      <w:r>
+        <w:t>{{project.metadata_line}}</w:t>
+      </w:r>
+    </w:p>
+    <w:p>
+      <w:pPr/>
+      <w:r>
+        <w:t>{%p endif %}</w:t>
+      </w:r>
+    </w:p>
+    <w:p>
+      <w:pPr/>
+      <w:r>
+        <w:t>{%p for bullet in project.bullets %}</w:t>
+      </w:r>
+    </w:p>
+    <w:p>
+      <w:pPr>
+        <w:pStyle w:val="BulletStyle"/>
+      </w:pPr>
+      <w:r>
+        <w:t>• {{bullet}}</w:t>
+      </w:r>
+    </w:p>
+    <w:p>
+      <w:pPr/>
+      <w:r>
+        <w:t>{%p endfor %}</w:t>
+      </w:r>
+    </w:p>
+    <w:p>
+      <w:pPr/>
+      <w:r>
+        <w:t>{%p endfor %}</w:t>
+      </w:r>
+    </w:p>
+    <w:p>
+      <w:pPr/>
+      <w:r>
+        <w:t>{%p endif %}</w:t>
       </w:r>
     </w:p>
     <w:p>

</xml_diff>